<commit_message>
- run_batch.sh: unattended headless sweep (N obstacles x seeds), per-run   artifact dirs, readiness checks, watchdog timeout, failure taxonomy - compute_metrics.py: metrics.csv + per-N summary + plots (success rate,   nav time, path/Euclidean ratio, hits, min clearance) - Final sweep N in {1,2,4,6,8,10} x 8 seeds: 48/48 SUCCEEDED, 0 hits;   time 29.3->31.6s, ratio 0.980->1.021, min clearance 0.80->0.37m - All observed failures were host-load IPC timeouts, never navigation;   fixed bt_navigator default_server_timeout (correct param name) + rerun   affected seeds identically - Curated results in results/2026-07-17_static_sweep/ (CSV, table, plots) - Repo reorganized: early experiments -> early_versions/, nav2/old removed - Progress report updated through Phase B
</commit_message>
<xml_diff>
--- a/Thesis Progress.docx
+++ b/Thesis Progress.docx
@@ -2542,6 +2542,232 @@
           <w:rtl w:val="0"/>
         </w:rPr>
         <w:t xml:space="preserve"> — teardown (stop Nav2 with Ctrl+C in its terminal)</w:t>
+      </w:r>
+    </w:p>
+    <w:p>
+      <w:pPr>
+        <w:pStyle w:val="Heading2"/>
+        <w:keepNext w:val="0"/>
+        <w:keepLines w:val="0"/>
+        <w:spacing w:after="80" w:lineRule="auto"/>
+        <w:rPr>
+          <w:b w:val="1"/>
+          <w:bCs w:val="1"/>
+          <w:sz w:val="34"/>
+          <w:szCs w:val="34"/>
+        </w:rPr>
+      </w:pPr>
+      <w:r>
+        <w:rPr>
+          <w:b w:val="1"/>
+          <w:bCs w:val="1"/>
+          <w:sz w:val="34"/>
+          <w:szCs w:val="34"/>
+          <w:rtl w:val="0"/>
+        </w:rPr>
+        <w:t xml:space="preserve">Phase B: Batch Evaluation with Static Obstacles</w:t>
+      </w:r>
+    </w:p>
+    <w:p>
+      <w:pPr>
+        <w:rPr/>
+      </w:pPr>
+      <w:r>
+        <w:rPr>
+          <w:rtl w:val="0"/>
+        </w:rPr>
+        <w:t xml:space="preserve">To produce the requested statistics, I built an unattended batch runner (</w:t>
+      </w:r>
+      <w:r>
+        <w:rPr>
+          <w:rFonts w:ascii="Roboto Mono" w:cs="Roboto Mono" w:eastAsia="Roboto Mono" w:hAnsi="Roboto Mono"/>
+          <w:color w:val="188038"/>
+          <w:rtl w:val="0"/>
+        </w:rPr>
+        <w:t xml:space="preserve">run_batch.sh</w:t>
+      </w:r>
+      <w:r>
+        <w:rPr>
+          <w:rtl w:val="0"/>
+        </w:rPr>
+        <w:t xml:space="preserve">). For every combination of obstacle count and random seed it generates a fresh scenario, starts the whole stack headless (no terminal windows), waits for the odometry and Nav2 to become ready, arms the drone, sends the scenario goal under a watchdog timeout, saves every component’s log together with the feedback stream and the hit counter’s totals, and tears everything down before the next run. Failures are recorded and the batch continues. A companion script, </w:t>
+      </w:r>
+      <w:r>
+        <w:rPr>
+          <w:rFonts w:ascii="Roboto Mono" w:cs="Roboto Mono" w:eastAsia="Roboto Mono" w:hAnsi="Roboto Mono"/>
+          <w:color w:val="188038"/>
+          <w:rtl w:val="0"/>
+        </w:rPr>
+        <w:t xml:space="preserve">compute_metrics.py</w:t>
+      </w:r>
+      <w:r>
+        <w:rPr>
+          <w:rtl w:val="0"/>
+        </w:rPr>
+        <w:t xml:space="preserve">, parses the recorded artifacts into a CSV and aggregates success rate, navigation time, the path-to-Euclidean-distance ratio, hit count, and minimum obstacle clearance per obstacle count, and renders the corresponding plots.</w:t>
+      </w:r>
+    </w:p>
+    <w:p>
+      <w:pPr>
+        <w:rPr/>
+      </w:pPr>
+      <w:r>
+        <w:rPr>
+          <w:rtl w:val="0"/>
+        </w:rPr>
+        <w:t xml:space="preserve">The main experiment swept 1, 2, 4, 6, 8, and 10 obstacles with 8 random seeds each — 48 runs, about 46 minutes unattended in the VM. All 48 runs succeeded with zero collisions:</w:t>
+      </w:r>
+    </w:p>
+    <w:p>
+      <w:pPr>
+        <w:rPr/>
+      </w:pPr>
+      <w:r>
+        <w:rPr>
+          <w:rFonts w:ascii="Roboto Mono" w:cs="Roboto Mono" w:eastAsia="Roboto Mono" w:hAnsi="Roboto Mono"/>
+          <w:color w:val="188038"/>
+          <w:rtl w:val="0"/>
+        </w:rPr>
+        <w:t xml:space="preserve">  N   success   mean time   path/Euclid   hits   min clearance</w:t>
+      </w:r>
+    </w:p>
+    <w:p>
+      <w:pPr>
+        <w:rPr/>
+      </w:pPr>
+      <w:r>
+        <w:rPr>
+          <w:rFonts w:ascii="Roboto Mono" w:cs="Roboto Mono" w:eastAsia="Roboto Mono" w:hAnsi="Roboto Mono"/>
+          <w:color w:val="188038"/>
+          <w:rtl w:val="0"/>
+        </w:rPr>
+        <w:t xml:space="preserve">  1     8/8      29.3 s        0.980        0        0.80 m</w:t>
+      </w:r>
+    </w:p>
+    <w:p>
+      <w:pPr>
+        <w:rPr/>
+      </w:pPr>
+      <w:r>
+        <w:rPr>
+          <w:rFonts w:ascii="Roboto Mono" w:cs="Roboto Mono" w:eastAsia="Roboto Mono" w:hAnsi="Roboto Mono"/>
+          <w:color w:val="188038"/>
+          <w:rtl w:val="0"/>
+        </w:rPr>
+        <w:t xml:space="preserve">  2     8/8      29.3 s        0.981        0        0.76 m</w:t>
+      </w:r>
+    </w:p>
+    <w:p>
+      <w:pPr>
+        <w:rPr/>
+      </w:pPr>
+      <w:r>
+        <w:rPr>
+          <w:rFonts w:ascii="Roboto Mono" w:cs="Roboto Mono" w:eastAsia="Roboto Mono" w:hAnsi="Roboto Mono"/>
+          <w:color w:val="188038"/>
+          <w:rtl w:val="0"/>
+        </w:rPr>
+        <w:t xml:space="preserve">  4     8/8      29.3 s        0.986        0        0.52 m</w:t>
+      </w:r>
+    </w:p>
+    <w:p>
+      <w:pPr>
+        <w:rPr/>
+      </w:pPr>
+      <w:r>
+        <w:rPr>
+          <w:rFonts w:ascii="Roboto Mono" w:cs="Roboto Mono" w:eastAsia="Roboto Mono" w:hAnsi="Roboto Mono"/>
+          <w:color w:val="188038"/>
+          <w:rtl w:val="0"/>
+        </w:rPr>
+        <w:t xml:space="preserve">  6     8/8      30.6 s        1.001        0        0.38 m</w:t>
+      </w:r>
+    </w:p>
+    <w:p>
+      <w:pPr>
+        <w:rPr/>
+      </w:pPr>
+      <w:r>
+        <w:rPr>
+          <w:rFonts w:ascii="Roboto Mono" w:cs="Roboto Mono" w:eastAsia="Roboto Mono" w:hAnsi="Roboto Mono"/>
+          <w:color w:val="188038"/>
+          <w:rtl w:val="0"/>
+        </w:rPr>
+        <w:t xml:space="preserve">  8     8/8      31.5 s        1.019        0        0.37 m</w:t>
+      </w:r>
+    </w:p>
+    <w:p>
+      <w:pPr>
+        <w:rPr/>
+      </w:pPr>
+      <w:r>
+        <w:rPr>
+          <w:rFonts w:ascii="Roboto Mono" w:cs="Roboto Mono" w:eastAsia="Roboto Mono" w:hAnsi="Roboto Mono"/>
+          <w:color w:val="188038"/>
+          <w:rtl w:val="0"/>
+        </w:rPr>
+        <w:t xml:space="preserve"> 10     8/8      31.6 s        1.021        0        0.37 m</w:t>
+      </w:r>
+    </w:p>
+    <w:p>
+      <w:pPr>
+        <w:rPr/>
+      </w:pPr>
+      <w:r>
+        <w:rPr>
+          <w:rtl w:val="0"/>
+        </w:rPr>
+        <w:t xml:space="preserve">The trends behave as expected: with few obstacles the random start–goal line is usually free, so the ratio sits slightly below 1 (the drone stops at the 0.3 m goal tolerance); as the field crowds, navigation time and detour overhead grow and the minimum clearance drops toward the costmap inflation radius, which acts as the effective safety margin. Ratios below 1.0 are an artifact of measuring the flown path against the full start-to-goal distance while the goal checker accepts arrival within 0.3 m.</w:t>
+      </w:r>
+    </w:p>
+    <w:p>
+      <w:pPr>
+        <w:rPr/>
+      </w:pPr>
+      <w:r>
+        <w:rPr>
+          <w:rtl w:val="0"/>
+        </w:rPr>
+        <w:t xml:space="preserve">Reliability of the harness itself was the main lesson of this phase. Every failure observed across all batches was an infrastructure timeout, never a navigation failure: ROS 2 action-server handshakes timed out whenever the host machine starved the VM (an open RViz window during one batch; incoming video calls during another — the failed runs clustered exactly in the call windows). Two measures fixed this: raising Nav2’s behavior-tree IPC timeouts (</w:t>
+      </w:r>
+      <w:r>
+        <w:rPr>
+          <w:rFonts w:ascii="Roboto Mono" w:cs="Roboto Mono" w:eastAsia="Roboto Mono" w:hAnsi="Roboto Mono"/>
+          <w:color w:val="188038"/>
+          <w:rtl w:val="0"/>
+        </w:rPr>
+        <w:t xml:space="preserve">default_server_timeout</w:t>
+      </w:r>
+      <w:r>
+        <w:rPr>
+          <w:rtl w:val="0"/>
+        </w:rPr>
+        <w:t xml:space="preserve">, where I initially used a wrong parameter name that ROS silently ignored — a caution worth recording), and keeping the VM unloaded during batches. The affected runs were re-executed with identical seeds and configuration, giving the final 48/48. The curated results (CSV, summary table, plots) are stored in the repository under </w:t>
+      </w:r>
+      <w:r>
+        <w:rPr>
+          <w:rFonts w:ascii="Roboto Mono" w:cs="Roboto Mono" w:eastAsia="Roboto Mono" w:hAnsi="Roboto Mono"/>
+          <w:color w:val="188038"/>
+          <w:rtl w:val="0"/>
+        </w:rPr>
+        <w:t xml:space="preserve">results/2026-07-17_static_sweep/</w:t>
+      </w:r>
+      <w:r>
+        <w:rPr>
+          <w:rtl w:val="0"/>
+        </w:rPr>
+        <w:t xml:space="preserve">.</w:t>
+      </w:r>
+    </w:p>
+    <w:p>
+      <w:pPr>
+        <w:rPr/>
+      </w:pPr>
+      <w:r>
+        <w:rPr>
+          <w:rtl w:val="0"/>
+        </w:rPr>
+        <w:t xml:space="preserve">With the static-obstacle baseline established — Nav2 reliably avoids fixed obstacles at these densities — the next phase introduces moving obstacles at increasing speeds to locate the point where Nav2’s performance deteriorates, which motivates the additional avoidance component.</w:t>
       </w:r>
     </w:p>
     <w:p>

</xml_diff>

<commit_message>
Phase C complete: moving obstacles — Nav2 degradation quantified
- obstacle_mover.py: virtual obstacle motion (bouncing, seeded), /obstacles
  markers as single ground truth for lidar + hit monitor + RViz; moving
  scenarios omit Gazebo obstacle models
- gen_scenario.py --obstacle-speed; run_batch.sh OBSTACLE_SPEED;
  compute_metrics groups/plots by (N, speed)
- Hit window: counters reset at goal start, snapshot at goal end,
  pre-existing overlaps not counted
- Speed sweep N=6, v 0.2->2.0 x 8 seeds (48/48 completed): hits 1->73,
  time 32->71s, ratio 1.11->~1.9; beyond ~0.8 m/s obstacles outrun the
  drone and prediction-free replanning cannot compensate
- Curated results in results/2026-07-20_speed_sweep/; README + progress
  report updated through Phase C
</commit_message>
<xml_diff>
--- a/Thesis Progress.docx
+++ b/Thesis Progress.docx
@@ -2768,6 +2768,232 @@
           <w:rtl w:val="0"/>
         </w:rPr>
         <w:t xml:space="preserve">With the static-obstacle baseline established — Nav2 reliably avoids fixed obstacles at these densities — the next phase introduces moving obstacles at increasing speeds to locate the point where Nav2’s performance deteriorates, which motivates the additional avoidance component.</w:t>
+      </w:r>
+    </w:p>
+    <w:p>
+      <w:pPr>
+        <w:pStyle w:val="Heading2"/>
+        <w:keepNext w:val="0"/>
+        <w:keepLines w:val="0"/>
+        <w:spacing w:after="80" w:lineRule="auto"/>
+        <w:rPr>
+          <w:b w:val="1"/>
+          <w:bCs w:val="1"/>
+          <w:sz w:val="34"/>
+          <w:szCs w:val="34"/>
+        </w:rPr>
+      </w:pPr>
+      <w:r>
+        <w:rPr>
+          <w:b w:val="1"/>
+          <w:bCs w:val="1"/>
+          <w:sz w:val="34"/>
+          <w:szCs w:val="34"/>
+          <w:rtl w:val="0"/>
+        </w:rPr>
+        <w:t xml:space="preserve">Phase C: Moving Obstacles and the Limits of Nav2</w:t>
+      </w:r>
+    </w:p>
+    <w:p>
+      <w:pPr>
+        <w:rPr/>
+      </w:pPr>
+      <w:r>
+        <w:rPr>
+          <w:rtl w:val="0"/>
+        </w:rPr>
+        <w:t xml:space="preserve">The final part of the agreed protocol repeats the evaluation with obstacles that move faster and faster. Obstacle motion is implemented virtually, consistently with the sensing design: a dedicated node, </w:t>
+      </w:r>
+      <w:r>
+        <w:rPr>
+          <w:rFonts w:ascii="Roboto Mono" w:cs="Roboto Mono" w:eastAsia="Roboto Mono" w:hAnsi="Roboto Mono"/>
+          <w:color w:val="188038"/>
+          <w:rtl w:val="0"/>
+        </w:rPr>
+        <w:t xml:space="preserve">obstacle_mover.py</w:t>
+      </w:r>
+      <w:r>
+        <w:rPr>
+          <w:rtl w:val="0"/>
+        </w:rPr>
+        <w:t xml:space="preserve">, integrates each obstacle along a random direction at the configured speed, bouncing elastically off the workspace bounds, and publishes the current footprints at 20 Hz on an </w:t>
+      </w:r>
+      <w:r>
+        <w:rPr>
+          <w:rFonts w:ascii="Roboto Mono" w:cs="Roboto Mono" w:eastAsia="Roboto Mono" w:hAnsi="Roboto Mono"/>
+          <w:color w:val="188038"/>
+          <w:rtl w:val="0"/>
+        </w:rPr>
+        <w:t xml:space="preserve">/obstacles</w:t>
+      </w:r>
+      <w:r>
+        <w:rPr>
+          <w:rtl w:val="0"/>
+        </w:rPr>
+        <w:t xml:space="preserve"> topic. The virtual lidar and the hit monitor track that stream, so the drone always senses the obstacles where they currently are, and RViz renders the same data as moving boxes. Moving obstacles are deliberately not modeled in the Gazebo world: a physical model frozen at its spawn pose could collide with the drone at a position the obstacle has virtually left. </w:t>
+      </w:r>
+      <w:r>
+        <w:rPr>
+          <w:rFonts w:ascii="Roboto Mono" w:cs="Roboto Mono" w:eastAsia="Roboto Mono" w:hAnsi="Roboto Mono"/>
+          <w:color w:val="188038"/>
+          <w:rtl w:val="0"/>
+        </w:rPr>
+        <w:t xml:space="preserve">gen_scenario.py --obstacle-speed</w:t>
+      </w:r>
+      <w:r>
+        <w:rPr>
+          <w:rtl w:val="0"/>
+        </w:rPr>
+        <w:t xml:space="preserve"> extends the scenario format, and the batch runner sweeps speeds the same way it sweeps obstacle counts.</w:t>
+      </w:r>
+    </w:p>
+    <w:p>
+      <w:pPr>
+        <w:rPr/>
+      </w:pPr>
+      <w:r>
+        <w:rPr>
+          <w:rtl w:val="0"/>
+        </w:rPr>
+        <w:t xml:space="preserve">Hit counting was also made precise. The counters are reset when each navigation goal is sent and snapshotted when it resolves, so the measured window is exactly the navigation itself — an obstacle drifting over the drone while it is parked before or after a goal is not a navigation failure. A contact that already exists at the moment navigation starts is likewise excluded until it first releases.</w:t>
+      </w:r>
+    </w:p>
+    <w:p>
+      <w:pPr>
+        <w:rPr/>
+      </w:pPr>
+      <w:r>
+        <w:rPr>
+          <w:rtl w:val="0"/>
+        </w:rPr>
+        <w:t xml:space="preserve">The degradation experiment used 6 obstacles and 8 random seeds per speed, sweeping 0.2 to 2.0 m/s — 48 runs overnight in the VM, all completing:</w:t>
+      </w:r>
+    </w:p>
+    <w:p>
+      <w:pPr>
+        <w:rPr/>
+      </w:pPr>
+      <w:r>
+        <w:rPr>
+          <w:rFonts w:ascii="Roboto Mono" w:cs="Roboto Mono" w:eastAsia="Roboto Mono" w:hAnsi="Roboto Mono"/>
+          <w:color w:val="188038"/>
+          <w:rtl w:val="0"/>
+        </w:rPr>
+        <w:t xml:space="preserve"> v(m/s)   success   mean time   path/Euclid   hits (8 runs)</w:t>
+      </w:r>
+    </w:p>
+    <w:p>
+      <w:pPr>
+        <w:rPr/>
+      </w:pPr>
+      <w:r>
+        <w:rPr>
+          <w:rFonts w:ascii="Roboto Mono" w:cs="Roboto Mono" w:eastAsia="Roboto Mono" w:hAnsi="Roboto Mono"/>
+          <w:color w:val="188038"/>
+          <w:rtl w:val="0"/>
+        </w:rPr>
+        <w:t xml:space="preserve">  0.2       8/8       32 s         1.11            1</w:t>
+      </w:r>
+    </w:p>
+    <w:p>
+      <w:pPr>
+        <w:rPr/>
+      </w:pPr>
+      <w:r>
+        <w:rPr>
+          <w:rFonts w:ascii="Roboto Mono" w:cs="Roboto Mono" w:eastAsia="Roboto Mono" w:hAnsi="Roboto Mono"/>
+          <w:color w:val="188038"/>
+          <w:rtl w:val="0"/>
+        </w:rPr>
+        <w:t xml:space="preserve">  0.4       8/8       39 s         1.15           19</w:t>
+      </w:r>
+    </w:p>
+    <w:p>
+      <w:pPr>
+        <w:rPr/>
+      </w:pPr>
+      <w:r>
+        <w:rPr>
+          <w:rFonts w:ascii="Roboto Mono" w:cs="Roboto Mono" w:eastAsia="Roboto Mono" w:hAnsi="Roboto Mono"/>
+          <w:color w:val="188038"/>
+          <w:rtl w:val="0"/>
+        </w:rPr>
+        <w:t xml:space="preserve">  0.8       8/8       48 s         1.38            9</w:t>
+      </w:r>
+    </w:p>
+    <w:p>
+      <w:pPr>
+        <w:rPr/>
+      </w:pPr>
+      <w:r>
+        <w:rPr>
+          <w:rFonts w:ascii="Roboto Mono" w:cs="Roboto Mono" w:eastAsia="Roboto Mono" w:hAnsi="Roboto Mono"/>
+          <w:color w:val="188038"/>
+          <w:rtl w:val="0"/>
+        </w:rPr>
+        <w:t xml:space="preserve">  1.2       8/8       50 s         1.48           35</w:t>
+      </w:r>
+    </w:p>
+    <w:p>
+      <w:pPr>
+        <w:rPr/>
+      </w:pPr>
+      <w:r>
+        <w:rPr>
+          <w:rFonts w:ascii="Roboto Mono" w:cs="Roboto Mono" w:eastAsia="Roboto Mono" w:hAnsi="Roboto Mono"/>
+          <w:color w:val="188038"/>
+          <w:rtl w:val="0"/>
+        </w:rPr>
+        <w:t xml:space="preserve">  1.6       8/8       71 s         1.97           50</w:t>
+      </w:r>
+    </w:p>
+    <w:p>
+      <w:pPr>
+        <w:rPr/>
+      </w:pPr>
+      <w:r>
+        <w:rPr>
+          <w:rFonts w:ascii="Roboto Mono" w:cs="Roboto Mono" w:eastAsia="Roboto Mono" w:hAnsi="Roboto Mono"/>
+          <w:color w:val="188038"/>
+          <w:rtl w:val="0"/>
+        </w:rPr>
+        <w:t xml:space="preserve">  2.0       8/8       71 s         1.81           73</w:t>
+      </w:r>
+    </w:p>
+    <w:p>
+      <w:pPr>
+        <w:rPr/>
+      </w:pPr>
+      <w:r>
+        <w:rPr>
+          <w:rtl w:val="0"/>
+        </w:rPr>
+        <w:t xml:space="preserve">The pattern is exactly what the protocol was designed to expose. Because runs are not stopped on contact, the drone always eventually reaches its goal — goal completion alone would suggest nothing is wrong. The hit count tells the real story: from a single contact across all eight flights at 0.2 m/s to 73 contacts — roughly nine per flight — at 2.0 m/s, while navigation time doubles and the flown path stretches to about twice the straight-line distance. The mechanism is structural: Nav2 plans against a costmap that only records where obstacles are (and, through stale marks, where they recently were), with no notion of velocity. The drone’s own speed limit is about 0.6–0.7 m/s, so from roughly 0.8 m/s upward the obstacles are faster than the drone and reactive replanning cannot compensate. The curated results are in </w:t>
+      </w:r>
+      <w:r>
+        <w:rPr>
+          <w:rFonts w:ascii="Roboto Mono" w:cs="Roboto Mono" w:eastAsia="Roboto Mono" w:hAnsi="Roboto Mono"/>
+          <w:color w:val="188038"/>
+          <w:rtl w:val="0"/>
+        </w:rPr>
+        <w:t xml:space="preserve">results/2026-07-20_speed_sweep/</w:t>
+      </w:r>
+      <w:r>
+        <w:rPr>
+          <w:rtl w:val="0"/>
+        </w:rPr>
+        <w:t xml:space="preserve">.</w:t>
+      </w:r>
+    </w:p>
+    <w:p>
+      <w:pPr>
+        <w:rPr/>
+      </w:pPr>
+      <w:r>
+        <w:rPr>
+          <w:rtl w:val="0"/>
+        </w:rPr>
+        <w:t xml:space="preserve">This completes the evaluation protocol: Nav2 handles static and slow-moving obstacles well, and its performance deteriorates significantly once obstacle speed approaches the drone’s own. The measured gap — collisions rising sharply with obstacle speed — is precisely what the avoidance component to be added on top of Nav2 must close, and the same scenario generator, batch runner, and metrics will provide the with/without comparison.</w:t>
       </w:r>
     </w:p>
     <w:p>

</xml_diff>

<commit_message>
Docs: README covers both stages, progress report through Phase E
- README restructured into stage 1 (Nav2, 2D) and stage 2 (PX4, 3D), with a
  plain explanation of what Gazebo, PX4, MAVROS and our own nodes each do
- Full PX4 run procedure, one-time PX4 parameters, and the three gotchas that
  cost the most time: world/local frame conversion, force-disarm for
  destroying a drone in flight, and the ratio being meaningless for
  destroyed runs
- Progress report: PX4 and MAVLink migration, the PX4 3D navigation finding,
  3D maze scenarios and collision detection, and the verified baseline runs
- Removes the stale Thesis Progress.pdf export (report is now several phases
  newer; re-export when sharing)
</commit_message>
<xml_diff>
--- a/Thesis Progress.docx
+++ b/Thesis Progress.docx
@@ -2771,6 +2771,424 @@
           <w:rtl w:val="0"/>
         </w:rPr>
         <w:t xml:space="preserve">.</w:t>
+      </w:r>
+    </w:p>
+    <w:p>
+      <w:pPr>
+        <w:pStyle w:val="Heading2"/>
+        <w:keepNext w:val="0"/>
+        <w:keepLines w:val="0"/>
+        <w:spacing w:after="80" w:lineRule="auto"/>
+        <w:rPr>
+          <w:b w:val="1"/>
+          <w:bCs w:val="1"/>
+          <w:sz w:val="34"/>
+          <w:szCs w:val="34"/>
+        </w:rPr>
+      </w:pPr>
+      <w:r>
+        <w:rPr>
+          <w:b w:val="1"/>
+          <w:bCs w:val="1"/>
+          <w:sz w:val="34"/>
+          <w:szCs w:val="34"/>
+          <w:rtl w:val="0"/>
+        </w:rPr>
+        <w:t xml:space="preserve">Moving to PX4 and MAVLink</w:t>
+      </w:r>
+    </w:p>
+    <w:p>
+      <w:pPr>
+        <w:rPr/>
+      </w:pPr>
+      <w:r>
+        <w:rPr>
+          <w:rtl w:val="0"/>
+        </w:rPr>
+        <w:t xml:space="preserve">Following the feedback, I changed the architecture in two ways. First, communication with the simulated drone now goes through MAVLink, the protocol used between a real drone and its onboard software, instead of my own bridge. Second, the drone is now a PX4 vehicle, so the flight control software is the same one that runs on real hardware.</w:t>
+      </w:r>
+    </w:p>
+    <w:p>
+      <w:pPr>
+        <w:rPr/>
+      </w:pPr>
+      <w:r>
+        <w:rPr>
+          <w:rtl w:val="0"/>
+        </w:rPr>
+        <w:t xml:space="preserve">The setup has four parts. Gazebo simulates the physics. PX4 runs in software-in-the-loop mode and acts as the flight controller, keeping the drone stable and executing position commands. MAVROS translates between PX4’s MAVLink protocol and ROS 2. My own ROS 2 nodes decide where the drone should go and measure what happens.</w:t>
+      </w:r>
+    </w:p>
+    <w:p>
+      <w:pPr>
+        <w:rPr/>
+      </w:pPr>
+      <w:r>
+        <w:rPr>
+          <w:rtl w:val="0"/>
+        </w:rPr>
+        <w:t xml:space="preserve">I installed PX4 v1.17.0 and built it for simulation with the x500 quadcopter model. Two problems had to be solved before the drone would fly. PX4 refuses to arm when no ground control station is connected, so I wrote a small script that sends the minimal MAVLink heartbeat a ground station would send. PX4 also refused to arm because the simulated power monitoring reported unhealthy values, which is disabled with a parameter. After that the drone armed and took off, first from the PX4 console and then from ROS 2 through MAVROS.</w:t>
+      </w:r>
+    </w:p>
+    <w:p>
+      <w:pPr>
+        <w:rPr/>
+      </w:pPr>
+      <w:r>
+        <w:rPr>
+          <w:rtl w:val="0"/>
+        </w:rPr>
+        <w:t xml:space="preserve">The important step was offboard control. In offboard mode the drone follows position setpoints sent from outside, which is how a companion computer flies a real drone. PX4 requires setpoints to already be streaming at more than 2 Hz before it will accept the mode, so my node starts publishing first and only then requests the switch. With this the drone flew from ROS 2 to an arbitrary point in 3D, for example to (5, -4, 6), and held it to within a few centimetres. This is the control interface all the later experiments use.</w:t>
+      </w:r>
+    </w:p>
+    <w:p>
+      <w:pPr>
+        <w:pStyle w:val="Heading2"/>
+        <w:keepNext w:val="0"/>
+        <w:keepLines w:val="0"/>
+        <w:spacing w:after="80" w:lineRule="auto"/>
+        <w:rPr>
+          <w:b w:val="1"/>
+          <w:bCs w:val="1"/>
+          <w:sz w:val="34"/>
+          <w:szCs w:val="34"/>
+        </w:rPr>
+      </w:pPr>
+      <w:r>
+        <w:rPr>
+          <w:b w:val="1"/>
+          <w:bCs w:val="1"/>
+          <w:sz w:val="34"/>
+          <w:szCs w:val="34"/>
+          <w:rtl w:val="0"/>
+        </w:rPr>
+        <w:t xml:space="preserve">What PX4 Offers for 3D Navigation</w:t>
+      </w:r>
+    </w:p>
+    <w:p>
+      <w:pPr>
+        <w:rPr/>
+      </w:pPr>
+      <w:r>
+        <w:rPr>
+          <w:rtl w:val="0"/>
+        </w:rPr>
+        <w:t xml:space="preserve">The plan was to replace Nav2 with PX4’s own 3D path planning and collision avoidance. While setting this up I found that this software is no longer available. The PX4-Avoidance package, which contains the 3D local and global planners, was archived by the PX4 project in August 2024 and is marked as not maintained. It also only supports ROS 1 and Ubuntu 20.04, while my system uses ROS 2 and Ubuntu 24.04. The MAVLink path planning interface that connected an external planner to PX4 missions has also been withdrawn, and the current documentation says it should not be used in any PX4 version.</w:t>
+      </w:r>
+    </w:p>
+    <w:p>
+      <w:pPr>
+        <w:rPr/>
+      </w:pPr>
+      <w:r>
+        <w:rPr>
+          <w:rtl w:val="0"/>
+        </w:rPr>
+        <w:t xml:space="preserve">What PX4 still provides is Collision Prevention, which slows the drone before it reaches an obstacle. It works only in the horizontal plane and only in Position mode, so it cannot serve as a 3D navigation system for autonomous flight.</w:t>
+      </w:r>
+    </w:p>
+    <w:p>
+      <w:pPr>
+        <w:rPr/>
+      </w:pPr>
+      <w:r>
+        <w:rPr>
+          <w:rtl w:val="0"/>
+        </w:rPr>
+        <w:t xml:space="preserve">The approach PX4 recommends today is the one my setup already uses: the planning runs on the companion computer side in ROS 2, and PX4 executes the resulting setpoints in offboard mode. I reported this to my supervisor before building the experiments on top of it. One useful consequence is that, since PX4 offers no 3D avoidance of its own, the flights described below are a true baseline without any avoidance, and the component to be added has a clearly defined gap to close. The full note with sources is in the repository as </w:t>
+      </w:r>
+      <w:r>
+        <w:rPr>
+          <w:rFonts w:ascii="Roboto Mono" w:cs="Roboto Mono" w:eastAsia="Roboto Mono" w:hAnsi="Roboto Mono"/>
+          <w:color w:val="188038"/>
+          <w:rtl w:val="0"/>
+        </w:rPr>
+        <w:t xml:space="preserve">px4/FEASIBILITY_3D_NAVIGATION.md</w:t>
+      </w:r>
+      <w:r>
+        <w:rPr>
+          <w:rtl w:val="0"/>
+        </w:rPr>
+        <w:t xml:space="preserve">.</w:t>
+      </w:r>
+    </w:p>
+    <w:p>
+      <w:pPr>
+        <w:pStyle w:val="Heading2"/>
+        <w:keepNext w:val="0"/>
+        <w:keepLines w:val="0"/>
+        <w:spacing w:after="80" w:lineRule="auto"/>
+        <w:rPr>
+          <w:b w:val="1"/>
+          <w:bCs w:val="1"/>
+          <w:sz w:val="34"/>
+          <w:szCs w:val="34"/>
+        </w:rPr>
+      </w:pPr>
+      <w:r>
+        <w:rPr>
+          <w:b w:val="1"/>
+          <w:bCs w:val="1"/>
+          <w:sz w:val="34"/>
+          <w:szCs w:val="34"/>
+          <w:rtl w:val="0"/>
+        </w:rPr>
+        <w:t xml:space="preserve">3D Maze Scenarios and Collision Detection</w:t>
+      </w:r>
+    </w:p>
+    <w:p>
+      <w:pPr>
+        <w:rPr/>
+      </w:pPr>
+      <w:r>
+        <w:rPr>
+          <w:rtl w:val="0"/>
+        </w:rPr>
+        <w:t xml:space="preserve">For the 3D experiments I wrote a new scenario generator, </w:t>
+      </w:r>
+      <w:r>
+        <w:rPr>
+          <w:rFonts w:ascii="Roboto Mono" w:cs="Roboto Mono" w:eastAsia="Roboto Mono" w:hAnsi="Roboto Mono"/>
+          <w:color w:val="188038"/>
+          <w:rtl w:val="0"/>
+        </w:rPr>
+        <w:t xml:space="preserve">gen_scenario_3d.py</w:t>
+      </w:r>
+      <w:r>
+        <w:rPr>
+          <w:rtl w:val="0"/>
+        </w:rPr>
+        <w:t xml:space="preserve">. It places n obstacles at random, each a box standing on the ground with a random footprint and a random height, which produces the maze described in the plan. It also places k drones at random, each with its own target in 3D space, and keeps a clear zone around every start and target so that no drone begins or ends inside an obstacle. Everything is written to a single </w:t>
+      </w:r>
+      <w:r>
+        <w:rPr>
+          <w:rFonts w:ascii="Roboto Mono" w:cs="Roboto Mono" w:eastAsia="Roboto Mono" w:hAnsi="Roboto Mono"/>
+          <w:color w:val="188038"/>
+          <w:rtl w:val="0"/>
+        </w:rPr>
+        <w:t xml:space="preserve">scenario.yaml</w:t>
+      </w:r>
+      <w:r>
+        <w:rPr>
+          <w:rtl w:val="0"/>
+        </w:rPr>
+        <w:t xml:space="preserve">, and the same seed always reproduces the same scenario. The file already holds a list of drones, so the format does not need to change for the multi-drone phase.</w:t>
+      </w:r>
+    </w:p>
+    <w:p>
+      <w:pPr>
+        <w:rPr/>
+      </w:pPr>
+      <w:r>
+        <w:rPr>
+          <w:rtl w:val="0"/>
+        </w:rPr>
+        <w:t xml:space="preserve">The obstacles are inserted into the running Gazebo world at runtime rather than written into a world file. This keeps the PX4 installation untouched and, more importantly, means a new scenario can be loaded without restarting the simulator, which will save a lot of time in the batch experiments.</w:t>
+      </w:r>
+    </w:p>
+    <w:p>
+      <w:pPr>
+        <w:rPr/>
+      </w:pPr>
+      <w:r>
+        <w:rPr>
+          <w:rtl w:val="0"/>
+        </w:rPr>
+        <w:t xml:space="preserve">A second node, </w:t>
+      </w:r>
+      <w:r>
+        <w:rPr>
+          <w:rFonts w:ascii="Roboto Mono" w:cs="Roboto Mono" w:eastAsia="Roboto Mono" w:hAnsi="Roboto Mono"/>
+          <w:color w:val="188038"/>
+          <w:rtl w:val="0"/>
+        </w:rPr>
+        <w:t xml:space="preserve">collision_monitor_3d.py</w:t>
+      </w:r>
+      <w:r>
+        <w:rPr>
+          <w:rtl w:val="0"/>
+        </w:rPr>
+        <w:t xml:space="preserve">, checks the drone against every obstacle. The drone is treated as a sphere and each obstacle as a box, and because the boxes have different heights the check is genuinely three-dimensional: the same horizontal position is safe above a low obstacle and a collision against a tall one. Following the plan, a drone that collides is destroyed rather than counted and allowed to continue.</w:t>
+      </w:r>
+    </w:p>
+    <w:p>
+      <w:pPr>
+        <w:rPr/>
+      </w:pPr>
+      <w:r>
+        <w:rPr>
+          <w:rtl w:val="0"/>
+        </w:rPr>
+        <w:t xml:space="preserve">Two details took some work. The scenario is written in Gazebo world coordinates, but MAVROS reports the drone in PX4’s local frame, whose origin is wherever the drone was spawned. The nodes therefore convert between the two by adding the start position. Without this the drone flies to a completely different place. The second detail is that PX4 refuses an ordinary disarm command while the drone is in the air, answering "Disarming denied: not landed". In one test this meant a drone survived its own collision, tumbled around the world and eventually reached its target after travelling 350 m instead of 15 m, which would have been meaningless data. Sending the disarm command with PX4’s force option solves it.</w:t>
+      </w:r>
+    </w:p>
+    <w:p>
+      <w:pPr>
+        <w:pStyle w:val="Heading2"/>
+        <w:keepNext w:val="0"/>
+        <w:keepLines w:val="0"/>
+        <w:spacing w:after="80" w:lineRule="auto"/>
+        <w:rPr>
+          <w:b w:val="1"/>
+          <w:bCs w:val="1"/>
+          <w:sz w:val="34"/>
+          <w:szCs w:val="34"/>
+        </w:rPr>
+      </w:pPr>
+      <w:r>
+        <w:rPr>
+          <w:b w:val="1"/>
+          <w:bCs w:val="1"/>
+          <w:sz w:val="34"/>
+          <w:szCs w:val="34"/>
+          <w:rtl w:val="0"/>
+        </w:rPr>
+        <w:t xml:space="preserve">Baseline Missions in 3D</w:t>
+      </w:r>
+    </w:p>
+    <w:p>
+      <w:pPr>
+        <w:rPr/>
+      </w:pPr>
+      <w:r>
+        <w:rPr>
+          <w:rtl w:val="0"/>
+        </w:rPr>
+        <w:t xml:space="preserve">The mission node, </w:t>
+      </w:r>
+      <w:r>
+        <w:rPr>
+          <w:rFonts w:ascii="Roboto Mono" w:cs="Roboto Mono" w:eastAsia="Roboto Mono" w:hAnsi="Roboto Mono"/>
+          <w:color w:val="188038"/>
+          <w:rtl w:val="0"/>
+        </w:rPr>
+        <w:t xml:space="preserve">run_mission.py</w:t>
+      </w:r>
+      <w:r>
+        <w:rPr>
+          <w:rtl w:val="0"/>
+        </w:rPr>
+        <w:t xml:space="preserve">, flies a drone to its scenario target using offboard setpoints, with no avoidance of any kind. It climbs first and then heads for the target, records the flown path, and stops as soon as the drone either arrives or is destroyed. It writes the Euclidean distance between start and target, the distance actually travelled, their ratio, and the simulation time.</w:t>
+      </w:r>
+    </w:p>
+    <w:p>
+      <w:pPr>
+        <w:rPr/>
+      </w:pPr>
+      <w:r>
+        <w:rPr>
+          <w:rtl w:val="0"/>
+        </w:rPr>
+        <w:t xml:space="preserve">Both outcomes were verified. A mission through an 8-obstacle maze reached its target:</w:t>
+      </w:r>
+    </w:p>
+    <w:p>
+      <w:pPr>
+        <w:rPr/>
+      </w:pPr>
+      <w:r>
+        <w:rPr>
+          <w:rFonts w:ascii="Roboto Mono" w:cs="Roboto Mono" w:eastAsia="Roboto Mono" w:hAnsi="Roboto Mono"/>
+          <w:color w:val="188038"/>
+          <w:rtl w:val="0"/>
+        </w:rPr>
+        <w:t xml:space="preserve">  outcome: reached      euclidean 21.33 m   travelled 23.57 m</w:t>
+      </w:r>
+    </w:p>
+    <w:p>
+      <w:pPr>
+        <w:rPr/>
+      </w:pPr>
+      <w:r>
+        <w:rPr>
+          <w:rFonts w:ascii="Roboto Mono" w:cs="Roboto Mono" w:eastAsia="Roboto Mono" w:hAnsi="Roboto Mono"/>
+          <w:color w:val="188038"/>
+          <w:rtl w:val="0"/>
+        </w:rPr>
+        <w:t xml:space="preserve">  ratio: 1.105          time 11.6 s         min clearance 1.61 m</w:t>
+      </w:r>
+    </w:p>
+    <w:p>
+      <w:pPr>
+        <w:rPr/>
+      </w:pPr>
+      <w:r>
+        <w:rPr>
+          <w:rtl w:val="0"/>
+        </w:rPr>
+        <w:t xml:space="preserve">and a mission through a denser 30-obstacle maze was destroyed on the way:</w:t>
+      </w:r>
+    </w:p>
+    <w:p>
+      <w:pPr>
+        <w:rPr/>
+      </w:pPr>
+      <w:r>
+        <w:rPr>
+          <w:rFonts w:ascii="Roboto Mono" w:cs="Roboto Mono" w:eastAsia="Roboto Mono" w:hAnsi="Roboto Mono"/>
+          <w:color w:val="188038"/>
+          <w:rtl w:val="0"/>
+        </w:rPr>
+        <w:t xml:space="preserve">  outcome: destroyed    euclidean 15.13 m   travelled 8.50 m</w:t>
+      </w:r>
+    </w:p>
+    <w:p>
+      <w:pPr>
+        <w:rPr/>
+      </w:pPr>
+      <w:r>
+        <w:rPr>
+          <w:rFonts w:ascii="Roboto Mono" w:cs="Roboto Mono" w:eastAsia="Roboto Mono" w:hAnsi="Roboto Mono"/>
+          <w:color w:val="188038"/>
+          <w:rtl w:val="0"/>
+        </w:rPr>
+        <w:t xml:space="preserve">  collision at world (-7.49, -3.38, 5.68)   min clearance -0.067 m</w:t>
+      </w:r>
+    </w:p>
+    <w:p>
+      <w:pPr>
+        <w:rPr/>
+      </w:pPr>
+      <w:r>
+        <w:rPr>
+          <w:rtl w:val="0"/>
+        </w:rPr>
+        <w:t xml:space="preserve">The negative minimum clearance in the second run means the drone had entered the obstacle by about 7 cm when the collision was registered, and the recorded collision point matches the drone’s final position, so it stopped where it was hit. One point to remember for the evaluation: the ratio is only meaningful for drones that reach their target, because a drone destroyed halfway has travelled less than the straight-line distance and produces a ratio below 1. Averages will be taken over successful flights, with destroyed flights counted separately.</w:t>
+      </w:r>
+    </w:p>
+    <w:p>
+      <w:pPr>
+        <w:pStyle w:val="Heading2"/>
+        <w:keepNext w:val="0"/>
+        <w:keepLines w:val="0"/>
+        <w:spacing w:after="80" w:lineRule="auto"/>
+        <w:rPr>
+          <w:b w:val="1"/>
+          <w:bCs w:val="1"/>
+          <w:sz w:val="34"/>
+          <w:szCs w:val="34"/>
+        </w:rPr>
+      </w:pPr>
+      <w:r>
+        <w:rPr>
+          <w:b w:val="1"/>
+          <w:bCs w:val="1"/>
+          <w:sz w:val="34"/>
+          <w:szCs w:val="34"/>
+          <w:rtl w:val="0"/>
+        </w:rPr>
+        <w:t xml:space="preserve">Next Steps</w:t>
+      </w:r>
+    </w:p>
+    <w:p>
+      <w:pPr>
+        <w:rPr/>
+      </w:pPr>
+      <w:r>
+        <w:rPr>
+          <w:rtl w:val="0"/>
+        </w:rPr>
+        <w:t xml:space="preserve">The next phase adds multiple drones flying at the same time, each with its own target and each able to collide with the obstacles and with the other drones, with a run ending when every drone has either arrived or been destroyed. After that the batch runner and metrics will be extended to sweep combinations of obstacle count and drone count and report, for each (n, k) configuration, the number of collisions, the summed Euclidean and travelled distances, their ratio, the simulation time and the CPU time. Running several PX4 instances together with Gazebo is likely to exceed the memory of my virtual machine, so the larger experiments will probably be run on a more powerful computer. The project already runs unchanged on other machines.</w:t>
       </w:r>
     </w:p>
     <w:p>

</xml_diff>